<commit_message>
feat: refresh FAQ, home copy, and pricing card layout
Update FAQ from the latest Google Doc, refine home page messaging and pricing cards, and simplify header navigation for production.

Co-authored-by: Cursor <cursoragent@cursor.com>
</commit_message>
<xml_diff>
--- a/docs/FAQ.docx
+++ b/docs/FAQ.docx
@@ -1,6 +1,6 @@
 
 <file path=word/document.xml><?xml version="1.0" encoding="utf-8"?>
-<w:document xmlns:wpc="http://schemas.microsoft.com/office/word/2010/wordprocessingCanvas" xmlns:cx="http://schemas.microsoft.com/office/drawing/2014/chartex" xmlns:cx1="http://schemas.microsoft.com/office/drawing/2015/9/8/chartex" xmlns:cx2="http://schemas.microsoft.com/office/drawing/2015/10/21/chartex" xmlns:cx3="http://schemas.microsoft.com/office/drawing/2016/5/9/chartex" xmlns:cx4="http://schemas.microsoft.com/office/drawing/2016/5/10/chartex" xmlns:cx5="http://schemas.microsoft.com/office/drawing/2016/5/11/chartex" xmlns:cx6="http://schemas.microsoft.com/office/drawing/2016/5/12/chartex" xmlns:cx7="http://schemas.microsoft.com/office/drawing/2016/5/13/chartex" xmlns:cx8="http://schemas.microsoft.com/office/drawing/2016/5/14/chartex" xmlns:mc="http://schemas.openxmlformats.org/markup-compatibility/2006" xmlns:aink="http://schemas.microsoft.com/office/drawing/2016/ink" xmlns:am3d="http://schemas.microsoft.com/office/drawing/2017/model3d" xmlns:o="urn:schemas-microsoft-com:office:office" xmlns:oel="http://schemas.microsoft.com/office/2019/extlst" xmlns:r="http://schemas.openxmlformats.org/officeDocument/2006/relationships" xmlns:m="http://schemas.openxmlformats.org/officeDocument/2006/math" xmlns:v="urn:schemas-microsoft-com:vml" xmlns:wp14="http://schemas.microsoft.com/office/word/2010/wordprocessingDrawing" xmlns:wp="http://schemas.openxmlformats.org/drawingml/2006/wordprocessingDrawing" xmlns:w10="urn:schemas-microsoft-com:office:word" xmlns:w="http://schemas.openxmlformats.org/wordprocessingml/2006/main" xmlns:w14="http://schemas.microsoft.com/office/word/2010/wordml" xmlns:w15="http://schemas.microsoft.com/office/word/2012/wordml" xmlns:w16cex="http://schemas.microsoft.com/office/word/2018/wordml/cex" xmlns:w16cid="http://schemas.microsoft.com/office/word/2016/wordml/cid" xmlns:w16="http://schemas.microsoft.com/office/word/2018/wordml" xmlns:w16du="http://schemas.microsoft.com/office/word/2023/wordml/word16du" xmlns:w16sdtdh="http://schemas.microsoft.com/office/word/2020/wordml/sdtdatahash" xmlns:w16sdtfl="http://schemas.microsoft.com/office/word/2024/wordml/sdtformatlock" xmlns:w16se="http://schemas.microsoft.com/office/word/2015/wordml/symex" xmlns:wpg="http://schemas.microsoft.com/office/word/2010/wordprocessingGroup" xmlns:wpi="http://schemas.microsoft.com/office/word/2010/wordprocessingInk" xmlns:wne="http://schemas.microsoft.com/office/word/2006/wordml" xmlns:wps="http://schemas.microsoft.com/office/word/2010/wordprocessingShape" mc:Ignorable="w14 w15 w16se w16cid w16 w16cex w16sdtdh w16sdtfl w16du wp14">
+<w:document xmlns:wpc="http://schemas.microsoft.com/office/word/2010/wordprocessingCanvas" xmlns:cx="http://schemas.microsoft.com/office/drawing/2014/chartex" xmlns:cx1="http://schemas.microsoft.com/office/drawing/2015/9/8/chartex" xmlns:cx2="http://schemas.microsoft.com/office/drawing/2015/10/21/chartex" xmlns:cx3="http://schemas.microsoft.com/office/drawing/2016/5/9/chartex" xmlns:cx4="http://schemas.microsoft.com/office/drawing/2016/5/10/chartex" xmlns:cx5="http://schemas.microsoft.com/office/drawing/2016/5/11/chartex" xmlns:cx6="http://schemas.microsoft.com/office/drawing/2016/5/12/chartex" xmlns:cx7="http://schemas.microsoft.com/office/drawing/2016/5/13/chartex" xmlns:cx8="http://schemas.microsoft.com/office/drawing/2016/5/14/chartex" xmlns:mc="http://schemas.openxmlformats.org/markup-compatibility/2006" xmlns:m="http://schemas.openxmlformats.org/officeDocument/2006/math" xmlns:aink="http://schemas.microsoft.com/office/drawing/2016/ink" xmlns:am3d="http://schemas.microsoft.com/office/drawing/2017/model3d" xmlns:oel="http://schemas.microsoft.com/office/2019/extlst" xmlns:r="http://schemas.openxmlformats.org/officeDocument/2006/relationships" xmlns:wp14="http://schemas.microsoft.com/office/word/2010/wordprocessingDrawing" xmlns:wp="http://schemas.openxmlformats.org/drawingml/2006/wordprocessingDrawing" xmlns:wpg="http://schemas.microsoft.com/office/word/2010/wordprocessingGroup" xmlns:wpi="http://schemas.microsoft.com/office/word/2010/wordprocessingInk" xmlns:wps="http://schemas.microsoft.com/office/word/2010/wordprocessingShape" xmlns:o="urn:schemas-microsoft-com:office:office" xmlns:v="urn:schemas-microsoft-com:vml" xmlns:w10="urn:schemas-microsoft-com:office:word" xmlns:w="http://schemas.openxmlformats.org/wordprocessingml/2006/main" xmlns:w14="http://schemas.microsoft.com/office/word/2010/wordml" xmlns:w15="http://schemas.microsoft.com/office/word/2012/wordml" xmlns:w16cex="http://schemas.microsoft.com/office/word/2018/wordml/cex" xmlns:w16cid="http://schemas.microsoft.com/office/word/2016/wordml/cid" xmlns:w16="http://schemas.microsoft.com/office/word/2018/wordml" xmlns:w16sdtdh="http://schemas.microsoft.com/office/word/2020/wordml/sdtdatahash" xmlns:w16sdtfl="http://schemas.microsoft.com/office/word/2024/wordml/sdtformatlock" xmlns:w16se="http://schemas.microsoft.com/office/word/2015/wordml/symex" xmlns:w16du="http://schemas.microsoft.com/office/word/2023/wordml/word16du" xmlns:wne="http://schemas.microsoft.com/office/word/2006/wordml" mc:Ignorable="w14 w15 w16se w16cid w16 w16cex w16sdtdh w16sdtfl w16du wp14">
   <w:body>
     <w:p>
       <w:pPr>
@@ -1332,25 +1332,303 @@
     </w:p>
     <w:p>
       <w:pPr>
-        <w:spacing w:after="240" w:line="240" w:lineRule="auto"/>
-        <w:rPr>
-          <w:rFonts w:ascii="Times New Roman" w:eastAsia="Times New Roman" w:hAnsi="Times New Roman" w:cs="Times New Roman"/>
-          <w:kern w:val="0"/>
-          <w14:ligatures w14:val="none"/>
-        </w:rPr>
-      </w:pPr>
+        <w:spacing w:before="480" w:after="120" w:line="240" w:lineRule="auto"/>
+        <w:ind w:right="-720"/>
+        <w:outlineLvl w:val="0"/>
+        <w:rPr>
+          <w:rFonts w:ascii="Arial" w:eastAsia="Times New Roman" w:hAnsi="Arial" w:cs="Arial"/>
+          <w:b/>
+          <w:bCs/>
+          <w:color w:val="000000"/>
+          <w:kern w:val="36"/>
+          <w14:ligatures w14:val="none"/>
+        </w:rPr>
+      </w:pPr>
+      <w:r>
+        <w:rPr>
+          <w:rFonts w:ascii="Apple Color Emoji" w:eastAsia="Times New Roman" w:hAnsi="Apple Color Emoji" w:cs="Apple Color Emoji"/>
+          <w:b/>
+          <w:bCs/>
+          <w:color w:val="000000"/>
+          <w:kern w:val="36"/>
+          <w14:ligatures w14:val="none"/>
+        </w:rPr>
+        <w:t>❓</w:t>
+      </w:r>
+      <w:r>
+        <w:rPr>
+          <w:rFonts w:ascii="Arial" w:eastAsia="Times New Roman" w:hAnsi="Arial" w:cs="Arial"/>
+          <w:b/>
+          <w:bCs/>
+          <w:color w:val="000000"/>
+          <w:kern w:val="36"/>
+          <w14:ligatures w14:val="none"/>
+        </w:rPr>
+        <w:t xml:space="preserve">Q. </w:t>
+      </w:r>
+      <w:r>
+        <w:rPr>
+          <w:rFonts w:ascii="Arial" w:hAnsi="Arial" w:cs="Arial"/>
+          <w:b/>
+          <w:bCs/>
+          <w:color w:val="000000"/>
+        </w:rPr>
+        <w:t>What is the Founding Members Program?</w:t>
+      </w:r>
     </w:p>
     <w:p>
       <w:pPr>
-        <w:spacing w:after="0" w:line="240" w:lineRule="auto"/>
-        <w:rPr>
-          <w:rFonts w:ascii="Times New Roman" w:eastAsia="Times New Roman" w:hAnsi="Times New Roman" w:cs="Times New Roman"/>
+        <w:pStyle w:val="ListParagraph"/>
+        <w:numPr>
+          <w:ilvl w:val="0"/>
+          <w:numId w:val="18"/>
+        </w:numPr>
+        <w:spacing w:before="480" w:after="120" w:line="240" w:lineRule="auto"/>
+        <w:ind w:right="-720"/>
+        <w:outlineLvl w:val="0"/>
+        <w:rPr>
+          <w:rFonts w:ascii="Arial" w:eastAsia="Times New Roman" w:hAnsi="Arial" w:cs="Arial"/>
+          <w:b/>
+          <w:bCs/>
+          <w:color w:val="000000"/>
+          <w:kern w:val="36"/>
+          <w14:ligatures w14:val="none"/>
+        </w:rPr>
+      </w:pPr>
+      <w:r>
+        <w:rPr>
+          <w:rFonts w:ascii="Arial" w:hAnsi="Arial" w:cs="Arial"/>
+          <w:color w:val="000000"/>
+        </w:rPr>
+        <w:t>The Founding Members Program is a limited opportunity for ten investigators to receive enhanced onboarding benefits, three months of advisory support, direct founder access, and the opportunity to help shape future platform enhancements.</w:t>
+      </w:r>
+    </w:p>
+    <w:p>
+      <w:pPr>
+        <w:spacing w:before="480" w:after="120" w:line="240" w:lineRule="auto"/>
+        <w:ind w:right="-720"/>
+        <w:outlineLvl w:val="0"/>
+        <w:rPr>
+          <w:rFonts w:ascii="Arial" w:eastAsia="Times New Roman" w:hAnsi="Arial" w:cs="Arial"/>
+          <w:b/>
+          <w:bCs/>
+          <w:color w:val="000000"/>
+          <w:kern w:val="36"/>
+          <w14:ligatures w14:val="none"/>
+        </w:rPr>
+      </w:pPr>
+      <w:r>
+        <w:rPr>
+          <w:rFonts w:ascii="Apple Color Emoji" w:eastAsia="Times New Roman" w:hAnsi="Apple Color Emoji" w:cs="Apple Color Emoji"/>
+          <w:b/>
+          <w:bCs/>
+          <w:color w:val="000000"/>
+          <w:kern w:val="36"/>
+          <w14:ligatures w14:val="none"/>
+        </w:rPr>
+        <w:t>❓</w:t>
+      </w:r>
+      <w:r>
+        <w:rPr>
+          <w:rFonts w:ascii="Arial" w:eastAsia="Times New Roman" w:hAnsi="Arial" w:cs="Arial"/>
+          <w:b/>
+          <w:bCs/>
+          <w:color w:val="000000"/>
+          <w:kern w:val="36"/>
+          <w14:ligatures w14:val="none"/>
+        </w:rPr>
+        <w:t xml:space="preserve">Q. </w:t>
+      </w:r>
+      <w:r>
+        <w:rPr>
+          <w:rFonts w:ascii="Arial" w:hAnsi="Arial" w:cs="Arial"/>
+          <w:b/>
+          <w:bCs/>
+          <w:color w:val="000000"/>
+        </w:rPr>
+        <w:t>Is the Founding Members Program available to everyone?</w:t>
+      </w:r>
+      <w:r>
+        <w:rPr>
+          <w:rFonts w:ascii="Arial" w:eastAsia="Times New Roman" w:hAnsi="Arial" w:cs="Arial"/>
+          <w:b/>
+          <w:bCs/>
+          <w:color w:val="000000"/>
+          <w:kern w:val="36"/>
+          <w14:ligatures w14:val="none"/>
+        </w:rPr>
+        <w:t xml:space="preserve"> </w:t>
+      </w:r>
+    </w:p>
+    <w:p>
+      <w:pPr>
+        <w:pStyle w:val="ListParagraph"/>
+        <w:numPr>
+          <w:ilvl w:val="0"/>
+          <w:numId w:val="19"/>
+        </w:numPr>
+        <w:spacing w:before="480" w:after="120" w:line="240" w:lineRule="auto"/>
+        <w:ind w:right="-720"/>
+        <w:outlineLvl w:val="0"/>
+        <w:rPr>
+          <w:rFonts w:ascii="Arial" w:eastAsia="Times New Roman" w:hAnsi="Arial" w:cs="Arial"/>
+          <w:b/>
+          <w:bCs/>
+          <w:color w:val="000000"/>
+          <w:kern w:val="36"/>
+          <w14:ligatures w14:val="none"/>
+        </w:rPr>
+      </w:pPr>
+      <w:r>
+        <w:rPr>
+          <w:rFonts w:ascii="Arial" w:hAnsi="Arial" w:cs="Arial"/>
+          <w:color w:val="000000"/>
+        </w:rPr>
+        <w:t>No. The program is limited to ten investigators to ensure each participant receives personalized onboarding and support.</w:t>
+      </w:r>
+    </w:p>
+    <w:p>
+      <w:pPr>
+        <w:spacing w:before="480" w:after="120" w:line="240" w:lineRule="auto"/>
+        <w:ind w:right="-720"/>
+        <w:outlineLvl w:val="0"/>
+        <w:rPr>
+          <w:rFonts w:ascii="Arial" w:eastAsia="Times New Roman" w:hAnsi="Arial" w:cs="Arial"/>
+          <w:b/>
+          <w:bCs/>
+          <w:color w:val="000000"/>
+          <w:kern w:val="36"/>
+          <w14:ligatures w14:val="none"/>
+        </w:rPr>
+      </w:pPr>
+      <w:r>
+        <w:rPr>
+          <w:rFonts w:ascii="Apple Color Emoji" w:eastAsia="Times New Roman" w:hAnsi="Apple Color Emoji" w:cs="Apple Color Emoji"/>
+          <w:b/>
+          <w:bCs/>
+          <w:color w:val="000000"/>
+          <w:kern w:val="36"/>
+          <w14:ligatures w14:val="none"/>
+        </w:rPr>
+        <w:t>❓</w:t>
+      </w:r>
+      <w:r>
+        <w:rPr>
+          <w:rFonts w:ascii="Arial" w:eastAsia="Times New Roman" w:hAnsi="Arial" w:cs="Arial"/>
+          <w:b/>
+          <w:bCs/>
+          <w:color w:val="000000"/>
+          <w:kern w:val="36"/>
+          <w14:ligatures w14:val="none"/>
+        </w:rPr>
+        <w:t xml:space="preserve">Q. </w:t>
+      </w:r>
+      <w:r>
+        <w:rPr>
+          <w:rFonts w:ascii="Arial" w:hAnsi="Arial" w:cs="Arial"/>
+          <w:b/>
+          <w:bCs/>
           <w:kern w:val="0"/>
-          <w14:ligatures w14:val="none"/>
-        </w:rPr>
-      </w:pPr>
+        </w:rPr>
+        <w:t>How are Founding Members selected?</w:t>
+      </w:r>
     </w:p>
-    <w:p/>
+    <w:p>
+      <w:pPr>
+        <w:pStyle w:val="ListParagraph"/>
+        <w:numPr>
+          <w:ilvl w:val="0"/>
+          <w:numId w:val="20"/>
+        </w:numPr>
+        <w:spacing w:before="480" w:after="120" w:line="240" w:lineRule="auto"/>
+        <w:ind w:right="-720"/>
+        <w:outlineLvl w:val="0"/>
+        <w:rPr>
+          <w:rFonts w:ascii="Arial" w:eastAsia="Times New Roman" w:hAnsi="Arial" w:cs="Arial"/>
+          <w:b/>
+          <w:bCs/>
+          <w:color w:val="000000"/>
+          <w:kern w:val="36"/>
+          <w14:ligatures w14:val="none"/>
+        </w:rPr>
+      </w:pPr>
+      <w:r>
+        <w:rPr>
+          <w:rFonts w:ascii="Arial" w:hAnsi="Arial" w:cs="Arial"/>
+          <w:color w:val="000000"/>
+        </w:rPr>
+        <w:t>Founding Membership is limited to ten investigators and is offered on a first-come, first-served basis. Interested investigators complete a short Discovery Form, followed by a discovery call to discuss workflow needs, onboarding requirements, and program details before enrollment.</w:t>
+      </w:r>
+    </w:p>
+    <w:p>
+      <w:pPr>
+        <w:spacing w:before="480" w:after="120" w:line="240" w:lineRule="auto"/>
+        <w:ind w:right="-720"/>
+        <w:outlineLvl w:val="0"/>
+        <w:rPr>
+          <w:rFonts w:ascii="Arial" w:eastAsia="Times New Roman" w:hAnsi="Arial" w:cs="Arial"/>
+          <w:b/>
+          <w:bCs/>
+          <w:color w:val="000000"/>
+          <w:kern w:val="36"/>
+          <w14:ligatures w14:val="none"/>
+        </w:rPr>
+      </w:pPr>
+      <w:r>
+        <w:rPr>
+          <w:rFonts w:ascii="Apple Color Emoji" w:eastAsia="Times New Roman" w:hAnsi="Apple Color Emoji" w:cs="Apple Color Emoji"/>
+          <w:b/>
+          <w:bCs/>
+          <w:color w:val="000000"/>
+          <w:kern w:val="36"/>
+          <w14:ligatures w14:val="none"/>
+        </w:rPr>
+        <w:lastRenderedPageBreak/>
+        <w:t>❓</w:t>
+      </w:r>
+      <w:r>
+        <w:rPr>
+          <w:rFonts w:ascii="Arial" w:eastAsia="Times New Roman" w:hAnsi="Arial" w:cs="Arial"/>
+          <w:b/>
+          <w:bCs/>
+          <w:color w:val="000000"/>
+          <w:kern w:val="36"/>
+          <w14:ligatures w14:val="none"/>
+        </w:rPr>
+        <w:t xml:space="preserve">Q. </w:t>
+      </w:r>
+      <w:r>
+        <w:rPr>
+          <w:rFonts w:ascii="Arial" w:hAnsi="Arial" w:cs="Arial"/>
+          <w:b/>
+          <w:bCs/>
+          <w:color w:val="000000"/>
+        </w:rPr>
+        <w:t>Am I guaranteed a Founding Member spot if I complete the Discovery Form?</w:t>
+      </w:r>
+    </w:p>
+    <w:p>
+      <w:pPr>
+        <w:pStyle w:val="ListParagraph"/>
+        <w:numPr>
+          <w:ilvl w:val="0"/>
+          <w:numId w:val="21"/>
+        </w:numPr>
+        <w:spacing w:before="480" w:after="120" w:line="240" w:lineRule="auto"/>
+        <w:ind w:right="-720"/>
+        <w:outlineLvl w:val="0"/>
+        <w:rPr>
+          <w:rFonts w:ascii="Arial" w:hAnsi="Arial" w:cs="Arial"/>
+        </w:rPr>
+      </w:pPr>
+      <w:r>
+        <w:rPr>
+          <w:rFonts w:ascii="Arial" w:hAnsi="Arial" w:cs="Arial"/>
+          <w:color w:val="000000"/>
+        </w:rPr>
+        <w:t>Completing the Discovery Form does not reserve a spot. Founding Membership is limited to ten investigators and enrollment is offered on a first-come, first-served basis while positions remain available.</w:t>
+      </w:r>
+    </w:p>
     <w:sectPr>
       <w:pgSz w:w="12240" w:h="15840"/>
       <w:pgMar w:top="1440" w:right="1440" w:bottom="1440" w:left="1440" w:header="720" w:footer="720" w:gutter="0"/>
@@ -1361,7 +1639,7 @@
 </file>
 
 <file path=word/numbering.xml><?xml version="1.0" encoding="utf-8"?>
-<w:numbering xmlns:wpc="http://schemas.microsoft.com/office/word/2010/wordprocessingCanvas" xmlns:cx="http://schemas.microsoft.com/office/drawing/2014/chartex" xmlns:cx1="http://schemas.microsoft.com/office/drawing/2015/9/8/chartex" xmlns:cx2="http://schemas.microsoft.com/office/drawing/2015/10/21/chartex" xmlns:cx3="http://schemas.microsoft.com/office/drawing/2016/5/9/chartex" xmlns:cx4="http://schemas.microsoft.com/office/drawing/2016/5/10/chartex" xmlns:cx5="http://schemas.microsoft.com/office/drawing/2016/5/11/chartex" xmlns:cx6="http://schemas.microsoft.com/office/drawing/2016/5/12/chartex" xmlns:cx7="http://schemas.microsoft.com/office/drawing/2016/5/13/chartex" xmlns:cx8="http://schemas.microsoft.com/office/drawing/2016/5/14/chartex" xmlns:mc="http://schemas.openxmlformats.org/markup-compatibility/2006" xmlns:aink="http://schemas.microsoft.com/office/drawing/2016/ink" xmlns:am3d="http://schemas.microsoft.com/office/drawing/2017/model3d" xmlns:o="urn:schemas-microsoft-com:office:office" xmlns:oel="http://schemas.microsoft.com/office/2019/extlst" xmlns:r="http://schemas.openxmlformats.org/officeDocument/2006/relationships" xmlns:m="http://schemas.openxmlformats.org/officeDocument/2006/math" xmlns:v="urn:schemas-microsoft-com:vml" xmlns:wp14="http://schemas.microsoft.com/office/word/2010/wordprocessingDrawing" xmlns:wp="http://schemas.openxmlformats.org/drawingml/2006/wordprocessingDrawing" xmlns:w10="urn:schemas-microsoft-com:office:word" xmlns:w="http://schemas.openxmlformats.org/wordprocessingml/2006/main" xmlns:w14="http://schemas.microsoft.com/office/word/2010/wordml" xmlns:w15="http://schemas.microsoft.com/office/word/2012/wordml" xmlns:w16cex="http://schemas.microsoft.com/office/word/2018/wordml/cex" xmlns:w16cid="http://schemas.microsoft.com/office/word/2016/wordml/cid" xmlns:w16="http://schemas.microsoft.com/office/word/2018/wordml" xmlns:w16du="http://schemas.microsoft.com/office/word/2023/wordml/word16du" xmlns:w16sdtdh="http://schemas.microsoft.com/office/word/2020/wordml/sdtdatahash" xmlns:w16sdtfl="http://schemas.microsoft.com/office/word/2024/wordml/sdtformatlock" xmlns:w16se="http://schemas.microsoft.com/office/word/2015/wordml/symex" xmlns:wpg="http://schemas.microsoft.com/office/word/2010/wordprocessingGroup" xmlns:wpi="http://schemas.microsoft.com/office/word/2010/wordprocessingInk" xmlns:wne="http://schemas.microsoft.com/office/word/2006/wordml" xmlns:wps="http://schemas.microsoft.com/office/word/2010/wordprocessingShape" mc:Ignorable="w14 w15 w16se w16cid w16 w16cex w16sdtdh w16sdtfl w16du wp14">
+<w:numbering xmlns:wpc="http://schemas.microsoft.com/office/word/2010/wordprocessingCanvas" xmlns:cx="http://schemas.microsoft.com/office/drawing/2014/chartex" xmlns:cx1="http://schemas.microsoft.com/office/drawing/2015/9/8/chartex" xmlns:cx2="http://schemas.microsoft.com/office/drawing/2015/10/21/chartex" xmlns:cx3="http://schemas.microsoft.com/office/drawing/2016/5/9/chartex" xmlns:cx4="http://schemas.microsoft.com/office/drawing/2016/5/10/chartex" xmlns:cx5="http://schemas.microsoft.com/office/drawing/2016/5/11/chartex" xmlns:cx6="http://schemas.microsoft.com/office/drawing/2016/5/12/chartex" xmlns:cx7="http://schemas.microsoft.com/office/drawing/2016/5/13/chartex" xmlns:cx8="http://schemas.microsoft.com/office/drawing/2016/5/14/chartex" xmlns:mc="http://schemas.openxmlformats.org/markup-compatibility/2006" xmlns:m="http://schemas.openxmlformats.org/officeDocument/2006/math" xmlns:aink="http://schemas.microsoft.com/office/drawing/2016/ink" xmlns:am3d="http://schemas.microsoft.com/office/drawing/2017/model3d" xmlns:oel="http://schemas.microsoft.com/office/2019/extlst" xmlns:r="http://schemas.openxmlformats.org/officeDocument/2006/relationships" xmlns:wp14="http://schemas.microsoft.com/office/word/2010/wordprocessingDrawing" xmlns:wp="http://schemas.openxmlformats.org/drawingml/2006/wordprocessingDrawing" xmlns:wpg="http://schemas.microsoft.com/office/word/2010/wordprocessingGroup" xmlns:wpi="http://schemas.microsoft.com/office/word/2010/wordprocessingInk" xmlns:wps="http://schemas.microsoft.com/office/word/2010/wordprocessingShape" xmlns:o="urn:schemas-microsoft-com:office:office" xmlns:v="urn:schemas-microsoft-com:vml" xmlns:w10="urn:schemas-microsoft-com:office:word" xmlns:w="http://schemas.openxmlformats.org/wordprocessingml/2006/main" xmlns:w14="http://schemas.microsoft.com/office/word/2010/wordml" xmlns:w15="http://schemas.microsoft.com/office/word/2012/wordml" xmlns:w16cex="http://schemas.microsoft.com/office/word/2018/wordml/cex" xmlns:w16cid="http://schemas.microsoft.com/office/word/2016/wordml/cid" xmlns:w16="http://schemas.microsoft.com/office/word/2018/wordml" xmlns:w16sdtdh="http://schemas.microsoft.com/office/word/2020/wordml/sdtdatahash" xmlns:w16sdtfl="http://schemas.microsoft.com/office/word/2024/wordml/sdtformatlock" xmlns:w16se="http://schemas.microsoft.com/office/word/2015/wordml/symex" xmlns:w16du="http://schemas.microsoft.com/office/word/2023/wordml/word16du" xmlns:wne="http://schemas.microsoft.com/office/word/2006/wordml" mc:Ignorable="w14 w15 w16se w16cid w16 w16cex w16sdtdh w16sdtfl w16du wp14">
   <w:abstractNum w:abstractNumId="0" w15:restartNumberingAfterBreak="0">
     <w:nsid w:val="02B053EC"/>
     <w:multiLevelType w:val="hybridMultilevel"/>
@@ -1633,6 +1911,96 @@
     </w:lvl>
   </w:abstractNum>
   <w:abstractNum w:abstractNumId="3" w15:restartNumberingAfterBreak="0">
+    <w:nsid w:val="182E568F"/>
+    <w:multiLevelType w:val="hybridMultilevel"/>
+    <w:tmpl w:val="E9167178"/>
+    <w:lvl w:ilvl="0" w:tplc="FFFFFFFF">
+      <w:start w:val="1"/>
+      <w:numFmt w:val="upperLetter"/>
+      <w:lvlText w:val="%1."/>
+      <w:lvlJc w:val="left"/>
+      <w:pPr>
+        <w:ind w:left="720" w:hanging="360"/>
+      </w:pPr>
+      <w:rPr>
+        <w:rFonts w:ascii="Arial" w:hAnsi="Arial" w:cs="Arial" w:hint="default"/>
+        <w:sz w:val="24"/>
+      </w:rPr>
+    </w:lvl>
+    <w:lvl w:ilvl="1" w:tplc="FFFFFFFF" w:tentative="1">
+      <w:start w:val="1"/>
+      <w:numFmt w:val="lowerLetter"/>
+      <w:lvlText w:val="%2."/>
+      <w:lvlJc w:val="left"/>
+      <w:pPr>
+        <w:ind w:left="1440" w:hanging="360"/>
+      </w:pPr>
+    </w:lvl>
+    <w:lvl w:ilvl="2" w:tplc="FFFFFFFF" w:tentative="1">
+      <w:start w:val="1"/>
+      <w:numFmt w:val="lowerRoman"/>
+      <w:lvlText w:val="%3."/>
+      <w:lvlJc w:val="right"/>
+      <w:pPr>
+        <w:ind w:left="2160" w:hanging="180"/>
+      </w:pPr>
+    </w:lvl>
+    <w:lvl w:ilvl="3" w:tplc="FFFFFFFF" w:tentative="1">
+      <w:start w:val="1"/>
+      <w:numFmt w:val="decimal"/>
+      <w:lvlText w:val="%4."/>
+      <w:lvlJc w:val="left"/>
+      <w:pPr>
+        <w:ind w:left="2880" w:hanging="360"/>
+      </w:pPr>
+    </w:lvl>
+    <w:lvl w:ilvl="4" w:tplc="FFFFFFFF" w:tentative="1">
+      <w:start w:val="1"/>
+      <w:numFmt w:val="lowerLetter"/>
+      <w:lvlText w:val="%5."/>
+      <w:lvlJc w:val="left"/>
+      <w:pPr>
+        <w:ind w:left="3600" w:hanging="360"/>
+      </w:pPr>
+    </w:lvl>
+    <w:lvl w:ilvl="5" w:tplc="FFFFFFFF" w:tentative="1">
+      <w:start w:val="1"/>
+      <w:numFmt w:val="lowerRoman"/>
+      <w:lvlText w:val="%6."/>
+      <w:lvlJc w:val="right"/>
+      <w:pPr>
+        <w:ind w:left="4320" w:hanging="180"/>
+      </w:pPr>
+    </w:lvl>
+    <w:lvl w:ilvl="6" w:tplc="FFFFFFFF" w:tentative="1">
+      <w:start w:val="1"/>
+      <w:numFmt w:val="decimal"/>
+      <w:lvlText w:val="%7."/>
+      <w:lvlJc w:val="left"/>
+      <w:pPr>
+        <w:ind w:left="5040" w:hanging="360"/>
+      </w:pPr>
+    </w:lvl>
+    <w:lvl w:ilvl="7" w:tplc="FFFFFFFF" w:tentative="1">
+      <w:start w:val="1"/>
+      <w:numFmt w:val="lowerLetter"/>
+      <w:lvlText w:val="%8."/>
+      <w:lvlJc w:val="left"/>
+      <w:pPr>
+        <w:ind w:left="5760" w:hanging="360"/>
+      </w:pPr>
+    </w:lvl>
+    <w:lvl w:ilvl="8" w:tplc="FFFFFFFF" w:tentative="1">
+      <w:start w:val="1"/>
+      <w:numFmt w:val="lowerRoman"/>
+      <w:lvlText w:val="%9."/>
+      <w:lvlJc w:val="right"/>
+      <w:pPr>
+        <w:ind w:left="6480" w:hanging="180"/>
+      </w:pPr>
+    </w:lvl>
+  </w:abstractNum>
+  <w:abstractNum w:abstractNumId="4" w15:restartNumberingAfterBreak="0">
     <w:nsid w:val="189124EB"/>
     <w:multiLevelType w:val="hybridMultilevel"/>
     <w:tmpl w:val="620604AA"/>
@@ -1722,7 +2090,97 @@
       </w:pPr>
     </w:lvl>
   </w:abstractNum>
-  <w:abstractNum w:abstractNumId="4" w15:restartNumberingAfterBreak="0">
+  <w:abstractNum w:abstractNumId="5" w15:restartNumberingAfterBreak="0">
+    <w:nsid w:val="222D41EF"/>
+    <w:multiLevelType w:val="hybridMultilevel"/>
+    <w:tmpl w:val="E9167178"/>
+    <w:lvl w:ilvl="0" w:tplc="FFFFFFFF">
+      <w:start w:val="1"/>
+      <w:numFmt w:val="upperLetter"/>
+      <w:lvlText w:val="%1."/>
+      <w:lvlJc w:val="left"/>
+      <w:pPr>
+        <w:ind w:left="720" w:hanging="360"/>
+      </w:pPr>
+      <w:rPr>
+        <w:rFonts w:ascii="Arial" w:hAnsi="Arial" w:cs="Arial" w:hint="default"/>
+        <w:sz w:val="24"/>
+      </w:rPr>
+    </w:lvl>
+    <w:lvl w:ilvl="1" w:tplc="FFFFFFFF" w:tentative="1">
+      <w:start w:val="1"/>
+      <w:numFmt w:val="lowerLetter"/>
+      <w:lvlText w:val="%2."/>
+      <w:lvlJc w:val="left"/>
+      <w:pPr>
+        <w:ind w:left="1440" w:hanging="360"/>
+      </w:pPr>
+    </w:lvl>
+    <w:lvl w:ilvl="2" w:tplc="FFFFFFFF" w:tentative="1">
+      <w:start w:val="1"/>
+      <w:numFmt w:val="lowerRoman"/>
+      <w:lvlText w:val="%3."/>
+      <w:lvlJc w:val="right"/>
+      <w:pPr>
+        <w:ind w:left="2160" w:hanging="180"/>
+      </w:pPr>
+    </w:lvl>
+    <w:lvl w:ilvl="3" w:tplc="FFFFFFFF" w:tentative="1">
+      <w:start w:val="1"/>
+      <w:numFmt w:val="decimal"/>
+      <w:lvlText w:val="%4."/>
+      <w:lvlJc w:val="left"/>
+      <w:pPr>
+        <w:ind w:left="2880" w:hanging="360"/>
+      </w:pPr>
+    </w:lvl>
+    <w:lvl w:ilvl="4" w:tplc="FFFFFFFF" w:tentative="1">
+      <w:start w:val="1"/>
+      <w:numFmt w:val="lowerLetter"/>
+      <w:lvlText w:val="%5."/>
+      <w:lvlJc w:val="left"/>
+      <w:pPr>
+        <w:ind w:left="3600" w:hanging="360"/>
+      </w:pPr>
+    </w:lvl>
+    <w:lvl w:ilvl="5" w:tplc="FFFFFFFF" w:tentative="1">
+      <w:start w:val="1"/>
+      <w:numFmt w:val="lowerRoman"/>
+      <w:lvlText w:val="%6."/>
+      <w:lvlJc w:val="right"/>
+      <w:pPr>
+        <w:ind w:left="4320" w:hanging="180"/>
+      </w:pPr>
+    </w:lvl>
+    <w:lvl w:ilvl="6" w:tplc="FFFFFFFF" w:tentative="1">
+      <w:start w:val="1"/>
+      <w:numFmt w:val="decimal"/>
+      <w:lvlText w:val="%7."/>
+      <w:lvlJc w:val="left"/>
+      <w:pPr>
+        <w:ind w:left="5040" w:hanging="360"/>
+      </w:pPr>
+    </w:lvl>
+    <w:lvl w:ilvl="7" w:tplc="FFFFFFFF" w:tentative="1">
+      <w:start w:val="1"/>
+      <w:numFmt w:val="lowerLetter"/>
+      <w:lvlText w:val="%8."/>
+      <w:lvlJc w:val="left"/>
+      <w:pPr>
+        <w:ind w:left="5760" w:hanging="360"/>
+      </w:pPr>
+    </w:lvl>
+    <w:lvl w:ilvl="8" w:tplc="FFFFFFFF" w:tentative="1">
+      <w:start w:val="1"/>
+      <w:numFmt w:val="lowerRoman"/>
+      <w:lvlText w:val="%9."/>
+      <w:lvlJc w:val="right"/>
+      <w:pPr>
+        <w:ind w:left="6480" w:hanging="180"/>
+      </w:pPr>
+    </w:lvl>
+  </w:abstractNum>
+  <w:abstractNum w:abstractNumId="6" w15:restartNumberingAfterBreak="0">
     <w:nsid w:val="2AAF3941"/>
     <w:multiLevelType w:val="hybridMultilevel"/>
     <w:tmpl w:val="A3D00E2E"/>
@@ -1812,7 +2270,187 @@
       </w:pPr>
     </w:lvl>
   </w:abstractNum>
-  <w:abstractNum w:abstractNumId="5" w15:restartNumberingAfterBreak="0">
+  <w:abstractNum w:abstractNumId="7" w15:restartNumberingAfterBreak="0">
+    <w:nsid w:val="30D935D3"/>
+    <w:multiLevelType w:val="hybridMultilevel"/>
+    <w:tmpl w:val="E9167178"/>
+    <w:lvl w:ilvl="0" w:tplc="FFFFFFFF">
+      <w:start w:val="1"/>
+      <w:numFmt w:val="upperLetter"/>
+      <w:lvlText w:val="%1."/>
+      <w:lvlJc w:val="left"/>
+      <w:pPr>
+        <w:ind w:left="720" w:hanging="360"/>
+      </w:pPr>
+      <w:rPr>
+        <w:rFonts w:ascii="Arial" w:hAnsi="Arial" w:cs="Arial" w:hint="default"/>
+        <w:sz w:val="24"/>
+      </w:rPr>
+    </w:lvl>
+    <w:lvl w:ilvl="1" w:tplc="FFFFFFFF" w:tentative="1">
+      <w:start w:val="1"/>
+      <w:numFmt w:val="lowerLetter"/>
+      <w:lvlText w:val="%2."/>
+      <w:lvlJc w:val="left"/>
+      <w:pPr>
+        <w:ind w:left="1440" w:hanging="360"/>
+      </w:pPr>
+    </w:lvl>
+    <w:lvl w:ilvl="2" w:tplc="FFFFFFFF" w:tentative="1">
+      <w:start w:val="1"/>
+      <w:numFmt w:val="lowerRoman"/>
+      <w:lvlText w:val="%3."/>
+      <w:lvlJc w:val="right"/>
+      <w:pPr>
+        <w:ind w:left="2160" w:hanging="180"/>
+      </w:pPr>
+    </w:lvl>
+    <w:lvl w:ilvl="3" w:tplc="FFFFFFFF" w:tentative="1">
+      <w:start w:val="1"/>
+      <w:numFmt w:val="decimal"/>
+      <w:lvlText w:val="%4."/>
+      <w:lvlJc w:val="left"/>
+      <w:pPr>
+        <w:ind w:left="2880" w:hanging="360"/>
+      </w:pPr>
+    </w:lvl>
+    <w:lvl w:ilvl="4" w:tplc="FFFFFFFF" w:tentative="1">
+      <w:start w:val="1"/>
+      <w:numFmt w:val="lowerLetter"/>
+      <w:lvlText w:val="%5."/>
+      <w:lvlJc w:val="left"/>
+      <w:pPr>
+        <w:ind w:left="3600" w:hanging="360"/>
+      </w:pPr>
+    </w:lvl>
+    <w:lvl w:ilvl="5" w:tplc="FFFFFFFF" w:tentative="1">
+      <w:start w:val="1"/>
+      <w:numFmt w:val="lowerRoman"/>
+      <w:lvlText w:val="%6."/>
+      <w:lvlJc w:val="right"/>
+      <w:pPr>
+        <w:ind w:left="4320" w:hanging="180"/>
+      </w:pPr>
+    </w:lvl>
+    <w:lvl w:ilvl="6" w:tplc="FFFFFFFF" w:tentative="1">
+      <w:start w:val="1"/>
+      <w:numFmt w:val="decimal"/>
+      <w:lvlText w:val="%7."/>
+      <w:lvlJc w:val="left"/>
+      <w:pPr>
+        <w:ind w:left="5040" w:hanging="360"/>
+      </w:pPr>
+    </w:lvl>
+    <w:lvl w:ilvl="7" w:tplc="FFFFFFFF" w:tentative="1">
+      <w:start w:val="1"/>
+      <w:numFmt w:val="lowerLetter"/>
+      <w:lvlText w:val="%8."/>
+      <w:lvlJc w:val="left"/>
+      <w:pPr>
+        <w:ind w:left="5760" w:hanging="360"/>
+      </w:pPr>
+    </w:lvl>
+    <w:lvl w:ilvl="8" w:tplc="FFFFFFFF" w:tentative="1">
+      <w:start w:val="1"/>
+      <w:numFmt w:val="lowerRoman"/>
+      <w:lvlText w:val="%9."/>
+      <w:lvlJc w:val="right"/>
+      <w:pPr>
+        <w:ind w:left="6480" w:hanging="180"/>
+      </w:pPr>
+    </w:lvl>
+  </w:abstractNum>
+  <w:abstractNum w:abstractNumId="8" w15:restartNumberingAfterBreak="0">
+    <w:nsid w:val="357E694C"/>
+    <w:multiLevelType w:val="hybridMultilevel"/>
+    <w:tmpl w:val="E9167178"/>
+    <w:lvl w:ilvl="0" w:tplc="FFFFFFFF">
+      <w:start w:val="1"/>
+      <w:numFmt w:val="upperLetter"/>
+      <w:lvlText w:val="%1."/>
+      <w:lvlJc w:val="left"/>
+      <w:pPr>
+        <w:ind w:left="720" w:hanging="360"/>
+      </w:pPr>
+      <w:rPr>
+        <w:rFonts w:ascii="Arial" w:hAnsi="Arial" w:cs="Arial" w:hint="default"/>
+        <w:sz w:val="24"/>
+      </w:rPr>
+    </w:lvl>
+    <w:lvl w:ilvl="1" w:tplc="FFFFFFFF" w:tentative="1">
+      <w:start w:val="1"/>
+      <w:numFmt w:val="lowerLetter"/>
+      <w:lvlText w:val="%2."/>
+      <w:lvlJc w:val="left"/>
+      <w:pPr>
+        <w:ind w:left="1440" w:hanging="360"/>
+      </w:pPr>
+    </w:lvl>
+    <w:lvl w:ilvl="2" w:tplc="FFFFFFFF" w:tentative="1">
+      <w:start w:val="1"/>
+      <w:numFmt w:val="lowerRoman"/>
+      <w:lvlText w:val="%3."/>
+      <w:lvlJc w:val="right"/>
+      <w:pPr>
+        <w:ind w:left="2160" w:hanging="180"/>
+      </w:pPr>
+    </w:lvl>
+    <w:lvl w:ilvl="3" w:tplc="FFFFFFFF" w:tentative="1">
+      <w:start w:val="1"/>
+      <w:numFmt w:val="decimal"/>
+      <w:lvlText w:val="%4."/>
+      <w:lvlJc w:val="left"/>
+      <w:pPr>
+        <w:ind w:left="2880" w:hanging="360"/>
+      </w:pPr>
+    </w:lvl>
+    <w:lvl w:ilvl="4" w:tplc="FFFFFFFF" w:tentative="1">
+      <w:start w:val="1"/>
+      <w:numFmt w:val="lowerLetter"/>
+      <w:lvlText w:val="%5."/>
+      <w:lvlJc w:val="left"/>
+      <w:pPr>
+        <w:ind w:left="3600" w:hanging="360"/>
+      </w:pPr>
+    </w:lvl>
+    <w:lvl w:ilvl="5" w:tplc="FFFFFFFF" w:tentative="1">
+      <w:start w:val="1"/>
+      <w:numFmt w:val="lowerRoman"/>
+      <w:lvlText w:val="%6."/>
+      <w:lvlJc w:val="right"/>
+      <w:pPr>
+        <w:ind w:left="4320" w:hanging="180"/>
+      </w:pPr>
+    </w:lvl>
+    <w:lvl w:ilvl="6" w:tplc="FFFFFFFF" w:tentative="1">
+      <w:start w:val="1"/>
+      <w:numFmt w:val="decimal"/>
+      <w:lvlText w:val="%7."/>
+      <w:lvlJc w:val="left"/>
+      <w:pPr>
+        <w:ind w:left="5040" w:hanging="360"/>
+      </w:pPr>
+    </w:lvl>
+    <w:lvl w:ilvl="7" w:tplc="FFFFFFFF" w:tentative="1">
+      <w:start w:val="1"/>
+      <w:numFmt w:val="lowerLetter"/>
+      <w:lvlText w:val="%8."/>
+      <w:lvlJc w:val="left"/>
+      <w:pPr>
+        <w:ind w:left="5760" w:hanging="360"/>
+      </w:pPr>
+    </w:lvl>
+    <w:lvl w:ilvl="8" w:tplc="FFFFFFFF" w:tentative="1">
+      <w:start w:val="1"/>
+      <w:numFmt w:val="lowerRoman"/>
+      <w:lvlText w:val="%9."/>
+      <w:lvlJc w:val="right"/>
+      <w:pPr>
+        <w:ind w:left="6480" w:hanging="180"/>
+      </w:pPr>
+    </w:lvl>
+  </w:abstractNum>
+  <w:abstractNum w:abstractNumId="9" w15:restartNumberingAfterBreak="0">
     <w:nsid w:val="3C8A433B"/>
     <w:multiLevelType w:val="hybridMultilevel"/>
     <w:tmpl w:val="61825428"/>
@@ -1902,7 +2540,7 @@
       </w:pPr>
     </w:lvl>
   </w:abstractNum>
-  <w:abstractNum w:abstractNumId="6" w15:restartNumberingAfterBreak="0">
+  <w:abstractNum w:abstractNumId="10" w15:restartNumberingAfterBreak="0">
     <w:nsid w:val="405C5DEF"/>
     <w:multiLevelType w:val="hybridMultilevel"/>
     <w:tmpl w:val="7068BFFA"/>
@@ -1992,7 +2630,7 @@
       </w:pPr>
     </w:lvl>
   </w:abstractNum>
-  <w:abstractNum w:abstractNumId="7" w15:restartNumberingAfterBreak="0">
+  <w:abstractNum w:abstractNumId="11" w15:restartNumberingAfterBreak="0">
     <w:nsid w:val="4CEE7BF1"/>
     <w:multiLevelType w:val="hybridMultilevel"/>
     <w:tmpl w:val="E926081E"/>
@@ -2081,7 +2719,7 @@
       </w:pPr>
     </w:lvl>
   </w:abstractNum>
-  <w:abstractNum w:abstractNumId="8" w15:restartNumberingAfterBreak="0">
+  <w:abstractNum w:abstractNumId="12" w15:restartNumberingAfterBreak="0">
     <w:nsid w:val="4FC45F77"/>
     <w:multiLevelType w:val="hybridMultilevel"/>
     <w:tmpl w:val="E9167178"/>
@@ -2171,7 +2809,7 @@
       </w:pPr>
     </w:lvl>
   </w:abstractNum>
-  <w:abstractNum w:abstractNumId="9" w15:restartNumberingAfterBreak="0">
+  <w:abstractNum w:abstractNumId="13" w15:restartNumberingAfterBreak="0">
     <w:nsid w:val="5AEB2A67"/>
     <w:multiLevelType w:val="hybridMultilevel"/>
     <w:tmpl w:val="41A61172"/>
@@ -2260,7 +2898,7 @@
       </w:pPr>
     </w:lvl>
   </w:abstractNum>
-  <w:abstractNum w:abstractNumId="10" w15:restartNumberingAfterBreak="0">
+  <w:abstractNum w:abstractNumId="14" w15:restartNumberingAfterBreak="0">
     <w:nsid w:val="5BED5D43"/>
     <w:multiLevelType w:val="hybridMultilevel"/>
     <w:tmpl w:val="D72072FA"/>
@@ -2350,7 +2988,7 @@
       </w:pPr>
     </w:lvl>
   </w:abstractNum>
-  <w:abstractNum w:abstractNumId="11" w15:restartNumberingAfterBreak="0">
+  <w:abstractNum w:abstractNumId="15" w15:restartNumberingAfterBreak="0">
     <w:nsid w:val="5C26628E"/>
     <w:multiLevelType w:val="hybridMultilevel"/>
     <w:tmpl w:val="3D86BAB8"/>
@@ -2440,7 +3078,7 @@
       </w:pPr>
     </w:lvl>
   </w:abstractNum>
-  <w:abstractNum w:abstractNumId="12" w15:restartNumberingAfterBreak="0">
+  <w:abstractNum w:abstractNumId="16" w15:restartNumberingAfterBreak="0">
     <w:nsid w:val="65CD2BA7"/>
     <w:multiLevelType w:val="hybridMultilevel"/>
     <w:tmpl w:val="49C69E1C"/>
@@ -2530,7 +3168,7 @@
       </w:pPr>
     </w:lvl>
   </w:abstractNum>
-  <w:abstractNum w:abstractNumId="13" w15:restartNumberingAfterBreak="0">
+  <w:abstractNum w:abstractNumId="17" w15:restartNumberingAfterBreak="0">
     <w:nsid w:val="662F708A"/>
     <w:multiLevelType w:val="hybridMultilevel"/>
     <w:tmpl w:val="3260D980"/>
@@ -2620,7 +3258,7 @@
       </w:pPr>
     </w:lvl>
   </w:abstractNum>
-  <w:abstractNum w:abstractNumId="14" w15:restartNumberingAfterBreak="0">
+  <w:abstractNum w:abstractNumId="18" w15:restartNumberingAfterBreak="0">
     <w:nsid w:val="6BCB15A7"/>
     <w:multiLevelType w:val="hybridMultilevel"/>
     <w:tmpl w:val="9E5A8D64"/>
@@ -2710,7 +3348,7 @@
       </w:pPr>
     </w:lvl>
   </w:abstractNum>
-  <w:abstractNum w:abstractNumId="15" w15:restartNumberingAfterBreak="0">
+  <w:abstractNum w:abstractNumId="19" w15:restartNumberingAfterBreak="0">
     <w:nsid w:val="702050CA"/>
     <w:multiLevelType w:val="hybridMultilevel"/>
     <w:tmpl w:val="C2B64CFA"/>
@@ -2800,7 +3438,7 @@
       </w:pPr>
     </w:lvl>
   </w:abstractNum>
-  <w:abstractNum w:abstractNumId="16" w15:restartNumberingAfterBreak="0">
+  <w:abstractNum w:abstractNumId="20" w15:restartNumberingAfterBreak="0">
     <w:nsid w:val="7A7102E1"/>
     <w:multiLevelType w:val="hybridMultilevel"/>
     <w:tmpl w:val="72DCE646"/>
@@ -2891,28 +3529,28 @@
     </w:lvl>
   </w:abstractNum>
   <w:num w:numId="1" w16cid:durableId="73823945">
-    <w:abstractNumId w:val="10"/>
+    <w:abstractNumId w:val="14"/>
   </w:num>
   <w:num w:numId="2" w16cid:durableId="1892228779">
     <w:abstractNumId w:val="2"/>
   </w:num>
   <w:num w:numId="3" w16cid:durableId="1303463822">
+    <w:abstractNumId w:val="15"/>
+  </w:num>
+  <w:num w:numId="4" w16cid:durableId="1485389026">
+    <w:abstractNumId w:val="10"/>
+  </w:num>
+  <w:num w:numId="5" w16cid:durableId="1969043865">
     <w:abstractNumId w:val="11"/>
   </w:num>
-  <w:num w:numId="4" w16cid:durableId="1485389026">
-    <w:abstractNumId w:val="6"/>
-  </w:num>
-  <w:num w:numId="5" w16cid:durableId="1969043865">
-    <w:abstractNumId w:val="7"/>
-  </w:num>
   <w:num w:numId="6" w16cid:durableId="4939943">
-    <w:abstractNumId w:val="12"/>
+    <w:abstractNumId w:val="16"/>
   </w:num>
   <w:num w:numId="7" w16cid:durableId="2102412057">
-    <w:abstractNumId w:val="5"/>
+    <w:abstractNumId w:val="9"/>
   </w:num>
   <w:num w:numId="8" w16cid:durableId="1666399615">
-    <w:abstractNumId w:val="13"/>
+    <w:abstractNumId w:val="17"/>
   </w:num>
   <w:num w:numId="9" w16cid:durableId="960693719">
     <w:abstractNumId w:val="0"/>
@@ -2921,31 +3559,43 @@
     <w:abstractNumId w:val="1"/>
   </w:num>
   <w:num w:numId="11" w16cid:durableId="517694540">
-    <w:abstractNumId w:val="3"/>
+    <w:abstractNumId w:val="4"/>
   </w:num>
   <w:num w:numId="12" w16cid:durableId="798229145">
-    <w:abstractNumId w:val="14"/>
+    <w:abstractNumId w:val="18"/>
   </w:num>
   <w:num w:numId="13" w16cid:durableId="2050954625">
-    <w:abstractNumId w:val="4"/>
+    <w:abstractNumId w:val="6"/>
   </w:num>
   <w:num w:numId="14" w16cid:durableId="216671265">
-    <w:abstractNumId w:val="16"/>
+    <w:abstractNumId w:val="20"/>
   </w:num>
   <w:num w:numId="15" w16cid:durableId="111098480">
-    <w:abstractNumId w:val="9"/>
+    <w:abstractNumId w:val="13"/>
   </w:num>
   <w:num w:numId="16" w16cid:durableId="1972587420">
-    <w:abstractNumId w:val="15"/>
+    <w:abstractNumId w:val="19"/>
   </w:num>
   <w:num w:numId="17" w16cid:durableId="362707738">
+    <w:abstractNumId w:val="12"/>
+  </w:num>
+  <w:num w:numId="18" w16cid:durableId="182670928">
+    <w:abstractNumId w:val="7"/>
+  </w:num>
+  <w:num w:numId="19" w16cid:durableId="1679582162">
     <w:abstractNumId w:val="8"/>
+  </w:num>
+  <w:num w:numId="20" w16cid:durableId="606039932">
+    <w:abstractNumId w:val="5"/>
+  </w:num>
+  <w:num w:numId="21" w16cid:durableId="2130854706">
+    <w:abstractNumId w:val="3"/>
   </w:num>
 </w:numbering>
 </file>
 
 <file path=word/styles.xml><?xml version="1.0" encoding="utf-8"?>
-<w:styles xmlns:mc="http://schemas.openxmlformats.org/markup-compatibility/2006" xmlns:r="http://schemas.openxmlformats.org/officeDocument/2006/relationships" xmlns:w="http://schemas.openxmlformats.org/wordprocessingml/2006/main" xmlns:w14="http://schemas.microsoft.com/office/word/2010/wordml" xmlns:w15="http://schemas.microsoft.com/office/word/2012/wordml" xmlns:w16cex="http://schemas.microsoft.com/office/word/2018/wordml/cex" xmlns:w16cid="http://schemas.microsoft.com/office/word/2016/wordml/cid" xmlns:w16="http://schemas.microsoft.com/office/word/2018/wordml" xmlns:w16du="http://schemas.microsoft.com/office/word/2023/wordml/word16du" xmlns:w16sdtdh="http://schemas.microsoft.com/office/word/2020/wordml/sdtdatahash" xmlns:w16sdtfl="http://schemas.microsoft.com/office/word/2024/wordml/sdtformatlock" xmlns:w16se="http://schemas.microsoft.com/office/word/2015/wordml/symex" mc:Ignorable="w14 w15 w16se w16cid w16 w16cex w16sdtdh w16sdtfl w16du">
+<w:styles xmlns:mc="http://schemas.openxmlformats.org/markup-compatibility/2006" xmlns:r="http://schemas.openxmlformats.org/officeDocument/2006/relationships" xmlns:w="http://schemas.openxmlformats.org/wordprocessingml/2006/main" xmlns:w14="http://schemas.microsoft.com/office/word/2010/wordml" xmlns:w15="http://schemas.microsoft.com/office/word/2012/wordml" xmlns:w16cex="http://schemas.microsoft.com/office/word/2018/wordml/cex" xmlns:w16cid="http://schemas.microsoft.com/office/word/2016/wordml/cid" xmlns:w16="http://schemas.microsoft.com/office/word/2018/wordml" xmlns:w16sdtdh="http://schemas.microsoft.com/office/word/2020/wordml/sdtdatahash" xmlns:w16sdtfl="http://schemas.microsoft.com/office/word/2024/wordml/sdtformatlock" xmlns:w16se="http://schemas.microsoft.com/office/word/2015/wordml/symex" xmlns:w16du="http://schemas.microsoft.com/office/word/2023/wordml/word16du" mc:Ignorable="w14 w15 w16se w16cid w16 w16cex w16sdtdh w16sdtfl w16du">
   <w:docDefaults>
     <w:rPrDefault>
       <w:rPr>

</xml_diff>